<commit_message>
era un spatiu gresit hehe xd
</commit_message>
<xml_diff>
--- a/Documentatie/Documentatie_Python.docx
+++ b/Documentatie/Documentatie_Python.docx
@@ -284,13 +284,6 @@
           <w:color w:val="000000" w:themeColor="text1"/>
         </w:rPr>
         <w:br/>
-      </w:r>
-      <w:r>
-        <w:rPr>
-          <w:rFonts w:cs="Times New Roman"/>
-          <w:b/>
-          <w:color w:val="000000" w:themeColor="text1"/>
-        </w:rPr>
         <w:t>DRILEA DAN-ALEXANDRU</w:t>
       </w:r>
       <w:r>
@@ -502,23 +495,7 @@
             <w:rFonts w:eastAsia="Times New Roman" w:cs="Times New Roman"/>
             <w:noProof/>
           </w:rPr>
-          <w:t>Introducere și Ecosis</w:t>
-        </w:r>
-        <w:r>
-          <w:rPr>
-            <w:rStyle w:val="Hyperlink"/>
-            <w:rFonts w:eastAsia="Times New Roman" w:cs="Times New Roman"/>
-            <w:noProof/>
-          </w:rPr>
-          <w:t>t</w:t>
-        </w:r>
-        <w:r>
-          <w:rPr>
-            <w:rStyle w:val="Hyperlink"/>
-            <w:rFonts w:eastAsia="Times New Roman" w:cs="Times New Roman"/>
-            <w:noProof/>
-          </w:rPr>
-          <w:t>emul Tehnologic</w:t>
+          <w:t>Introducere și Ecosistemul Tehnologic</w:t>
         </w:r>
         <w:r>
           <w:rPr>
@@ -2174,14 +2151,6 @@
         </w:rPr>
       </w:pPr>
       <w:hyperlink w:anchor="_Toc229408056" w:history="1">
-        <w:r>
-          <w:rPr>
-            <w:rStyle w:val="Hyperlink"/>
-            <w:rFonts w:cs="Times New Roman"/>
-            <w:noProof/>
-          </w:rPr>
-          <w:t xml:space="preserve"> </w:t>
-        </w:r>
         <w:r>
           <w:rPr>
             <w:rStyle w:val="Hyperlink"/>
@@ -2817,6 +2786,7 @@
       <w:r>
         <w:rPr>
           <w:rFonts w:eastAsia="Times New Roman" w:cs="Times New Roman"/>
+          <w:noProof/>
         </w:rPr>
         <w:lastRenderedPageBreak/>
         <w:drawing>
@@ -3009,6 +2979,7 @@
       <w:r>
         <w:rPr>
           <w:rFonts w:eastAsia="Times New Roman" w:cs="Times New Roman"/>
+          <w:noProof/>
         </w:rPr>
         <w:lastRenderedPageBreak/>
         <w:drawing>
@@ -3251,6 +3222,7 @@
       <w:r>
         <w:rPr>
           <w:rFonts w:eastAsia="Times New Roman" w:cs="Times New Roman"/>
+          <w:noProof/>
         </w:rPr>
         <w:lastRenderedPageBreak/>
         <w:drawing>
@@ -3330,6 +3302,7 @@
       <w:r>
         <w:rPr>
           <w:rFonts w:eastAsia="Times New Roman" w:cs="Times New Roman"/>
+          <w:noProof/>
         </w:rPr>
         <w:drawing>
           <wp:inline distT="0" distB="0" distL="0" distR="0" wp14:anchorId="246AFCDC" wp14:editId="37733D18">
@@ -3642,6 +3615,7 @@
       <w:r>
         <w:rPr>
           <w:rFonts w:eastAsia="Times New Roman" w:cs="Times New Roman"/>
+          <w:noProof/>
         </w:rPr>
         <w:drawing>
           <wp:inline distT="0" distB="0" distL="0" distR="0" wp14:anchorId="2B4AF14A" wp14:editId="75175E06">
@@ -3722,6 +3696,7 @@
       <w:r>
         <w:rPr>
           <w:rFonts w:eastAsia="Times New Roman" w:cs="Times New Roman"/>
+          <w:noProof/>
         </w:rPr>
         <w:lastRenderedPageBreak/>
         <w:drawing>
@@ -4040,6 +4015,7 @@
       <w:r>
         <w:rPr>
           <w:rFonts w:eastAsia="Times New Roman" w:cs="Times New Roman"/>
+          <w:noProof/>
         </w:rPr>
         <w:lastRenderedPageBreak/>
         <w:drawing>
@@ -4117,6 +4093,7 @@
       <w:r>
         <w:rPr>
           <w:rFonts w:eastAsia="Times New Roman" w:cs="Times New Roman"/>
+          <w:noProof/>
         </w:rPr>
         <w:drawing>
           <wp:inline distT="0" distB="0" distL="0" distR="0" wp14:anchorId="73FF2206" wp14:editId="1DC929E8">
@@ -4372,6 +4349,7 @@
       <w:r>
         <w:rPr>
           <w:rFonts w:eastAsia="Times New Roman" w:cs="Times New Roman"/>
+          <w:noProof/>
         </w:rPr>
         <w:drawing>
           <wp:inline distT="0" distB="0" distL="0" distR="0" wp14:anchorId="50FBECD0" wp14:editId="6BB8C96B">
@@ -4440,6 +4418,7 @@
       <w:r>
         <w:rPr>
           <w:rFonts w:eastAsia="Times New Roman" w:cs="Times New Roman"/>
+          <w:noProof/>
         </w:rPr>
         <w:drawing>
           <wp:inline distT="0" distB="0" distL="0" distR="0" wp14:anchorId="1AE493D5" wp14:editId="5002A6CA">
@@ -4683,14 +4662,51 @@
         <w:rPr>
           <w:rFonts w:eastAsia="Times New Roman" w:cs="Times New Roman"/>
         </w:rPr>
-        <w:t xml:space="preserve"> oferi ulterior predicții și </w:t>
-      </w:r>
+        <w:t xml:space="preserve"> oferi ulterior </w:t>
+      </w:r>
+      <w:proofErr w:type="spellStart"/>
+      <w:r>
+        <w:rPr>
+          <w:rFonts w:eastAsia="Times New Roman" w:cs="Times New Roman"/>
+        </w:rPr>
+        <w:t>predicții</w:t>
+      </w:r>
+      <w:proofErr w:type="spellEnd"/>
+      <w:r>
+        <w:rPr>
+          <w:rFonts w:eastAsia="Times New Roman" w:cs="Times New Roman"/>
+        </w:rPr>
+        <w:t xml:space="preserve"> </w:t>
+      </w:r>
+      <w:proofErr w:type="spellStart"/>
+      <w:r>
+        <w:rPr>
+          <w:rFonts w:eastAsia="Times New Roman" w:cs="Times New Roman"/>
+        </w:rPr>
+        <w:t>și</w:t>
+      </w:r>
+      <w:proofErr w:type="spellEnd"/>
+      <w:r>
+        <w:rPr>
+          <w:rFonts w:eastAsia="Times New Roman" w:cs="Times New Roman"/>
+        </w:rPr>
+        <w:t xml:space="preserve"> </w:t>
+      </w:r>
+      <w:proofErr w:type="spellStart"/>
       <w:r>
         <w:rPr>
           <w:rFonts w:eastAsia="Times New Roman" w:cs="Times New Roman"/>
           <w:b/>
         </w:rPr>
-        <w:t xml:space="preserve">probabilități </w:t>
+        <w:t>probabilități</w:t>
+      </w:r>
+      <w:proofErr w:type="spellEnd"/>
+      <w:r>
+        <w:rPr>
+          <w:rFonts w:eastAsia="Times New Roman" w:cs="Times New Roman"/>
+          <w:b/>
+        </w:rPr>
+        <w:t xml:space="preserve"> </w:t>
       </w:r>
       <w:proofErr w:type="spellStart"/>
       <w:r>
@@ -4745,6 +4761,7 @@
       <w:r>
         <w:rPr>
           <w:rFonts w:eastAsia="Times New Roman" w:cs="Times New Roman"/>
+          <w:noProof/>
         </w:rPr>
         <w:drawing>
           <wp:inline distT="0" distB="0" distL="0" distR="0" wp14:anchorId="50C0F593" wp14:editId="1599D80E">
@@ -4872,6 +4889,7 @@
       <w:r>
         <w:rPr>
           <w:rFonts w:eastAsia="Times New Roman" w:cs="Times New Roman"/>
+          <w:noProof/>
         </w:rPr>
         <w:drawing>
           <wp:inline distT="0" distB="0" distL="0" distR="0" wp14:anchorId="0420D1BA" wp14:editId="4D5C4752">
@@ -5117,6 +5135,7 @@
       <w:r>
         <w:rPr>
           <w:rFonts w:eastAsia="Times New Roman" w:cs="Times New Roman"/>
+          <w:noProof/>
         </w:rPr>
         <w:lastRenderedPageBreak/>
         <w:drawing>
@@ -5182,6 +5201,7 @@
       <w:r>
         <w:rPr>
           <w:rFonts w:eastAsia="Times New Roman" w:cs="Times New Roman"/>
+          <w:noProof/>
         </w:rPr>
         <w:drawing>
           <wp:inline distT="0" distB="0" distL="0" distR="0" wp14:anchorId="26CD3877" wp14:editId="1B476524">
@@ -5420,6 +5440,7 @@
       <w:r>
         <w:rPr>
           <w:rFonts w:eastAsia="Times New Roman" w:cs="Times New Roman"/>
+          <w:noProof/>
         </w:rPr>
         <w:drawing>
           <wp:inline distT="0" distB="0" distL="0" distR="0" wp14:anchorId="18965CEC" wp14:editId="02DEBC92">
@@ -5512,6 +5533,7 @@
       <w:r>
         <w:rPr>
           <w:rFonts w:eastAsia="Times New Roman" w:cs="Times New Roman"/>
+          <w:noProof/>
         </w:rPr>
         <w:lastRenderedPageBreak/>
         <w:drawing>
@@ -5599,6 +5621,7 @@
       <w:r>
         <w:rPr>
           <w:rFonts w:eastAsia="Times New Roman" w:cs="Times New Roman"/>
+          <w:noProof/>
         </w:rPr>
         <w:drawing>
           <wp:inline distT="0" distB="0" distL="0" distR="0" wp14:anchorId="76CFC21B" wp14:editId="4C6A77F0">
@@ -5749,7 +5772,35 @@
         <w:rPr>
           <w:rFonts w:eastAsia="Times New Roman" w:cs="Times New Roman"/>
         </w:rPr>
-        <w:t xml:space="preserve"> izolat deceniul inițial, recunoscând anii cu profituri și active mai modeste, dedicate finanțării </w:t>
+        <w:t xml:space="preserve"> izolat deceniul inițial, recunoscând anii cu profituri și active mai </w:t>
+      </w:r>
+      <w:proofErr w:type="spellStart"/>
+      <w:r>
+        <w:rPr>
+          <w:rFonts w:eastAsia="Times New Roman" w:cs="Times New Roman"/>
+        </w:rPr>
+        <w:t>modeste</w:t>
+      </w:r>
+      <w:proofErr w:type="spellEnd"/>
+      <w:r>
+        <w:rPr>
+          <w:rFonts w:eastAsia="Times New Roman" w:cs="Times New Roman"/>
+        </w:rPr>
+        <w:t xml:space="preserve">, dedicate </w:t>
+      </w:r>
+      <w:proofErr w:type="spellStart"/>
+      <w:r>
+        <w:rPr>
+          <w:rFonts w:eastAsia="Times New Roman" w:cs="Times New Roman"/>
+        </w:rPr>
+        <w:t>finanțării</w:t>
+      </w:r>
+      <w:proofErr w:type="spellEnd"/>
+      <w:r>
+        <w:rPr>
+          <w:rFonts w:eastAsia="Times New Roman" w:cs="Times New Roman"/>
+        </w:rPr>
+        <w:t xml:space="preserve"> </w:t>
       </w:r>
       <w:proofErr w:type="spellStart"/>
       <w:r>
@@ -6295,7 +6346,35 @@
         <w:rPr>
           <w:rFonts w:eastAsia="Times New Roman" w:cs="Times New Roman"/>
         </w:rPr>
-        <w:t xml:space="preserve">. A grupat anii recenți pe un profil unic: active (Assets) imense și profituri susținute ("Long-tail sales"), confirmând reziliența </w:t>
+        <w:t xml:space="preserve">. A grupat anii recenți pe un profil unic: active (Assets) imense și profituri susținute ("Long-tail sales"), </w:t>
+      </w:r>
+      <w:proofErr w:type="spellStart"/>
+      <w:r>
+        <w:rPr>
+          <w:rFonts w:eastAsia="Times New Roman" w:cs="Times New Roman"/>
+        </w:rPr>
+        <w:t>confirmând</w:t>
+      </w:r>
+      <w:proofErr w:type="spellEnd"/>
+      <w:r>
+        <w:rPr>
+          <w:rFonts w:eastAsia="Times New Roman" w:cs="Times New Roman"/>
+        </w:rPr>
+        <w:t xml:space="preserve"> </w:t>
+      </w:r>
+      <w:proofErr w:type="spellStart"/>
+      <w:r>
+        <w:rPr>
+          <w:rFonts w:eastAsia="Times New Roman" w:cs="Times New Roman"/>
+        </w:rPr>
+        <w:t>reziliența</w:t>
+      </w:r>
+      <w:proofErr w:type="spellEnd"/>
+      <w:r>
+        <w:rPr>
+          <w:rFonts w:eastAsia="Times New Roman" w:cs="Times New Roman"/>
+        </w:rPr>
+        <w:t xml:space="preserve"> </w:t>
       </w:r>
       <w:proofErr w:type="spellStart"/>
       <w:r>
@@ -11042,6 +11121,7 @@
   <w:style w:type="character" w:default="1" w:styleId="DefaultParagraphFont">
     <w:name w:val="Default Paragraph Font"/>
     <w:uiPriority w:val="1"/>
+    <w:semiHidden/>
     <w:unhideWhenUsed/>
   </w:style>
   <w:style w:type="table" w:default="1" w:styleId="TableNormal">

</xml_diff>